<commit_message>
complete standard deviation part 1
</commit_message>
<xml_diff>
--- a/02_standard_deviation/standard_deviation.docx
+++ b/02_standard_deviation/standard_deviation.docx
@@ -149,7 +149,7 @@
             <w:pPr>
               <w:jc w:val="center"/>
               <w:rPr>
-                <w:rFonts w:asciiTheme="majorBidi" w:hAnsiTheme="majorBidi" w:cstheme="majorBidi" w:hint="cs"/>
+                <w:rFonts w:asciiTheme="majorBidi" w:hAnsiTheme="majorBidi" w:cstheme="majorBidi"/>
                 <w:b/>
                 <w:bCs/>
                 <w:sz w:val="36"/>
@@ -182,7 +182,7 @@
             <w:pPr>
               <w:jc w:val="center"/>
               <w:rPr>
-                <w:rFonts w:asciiTheme="majorBidi" w:hAnsiTheme="majorBidi" w:cstheme="majorBidi" w:hint="cs"/>
+                <w:rFonts w:asciiTheme="majorBidi" w:hAnsiTheme="majorBidi" w:cstheme="majorBidi"/>
                 <w:b/>
                 <w:bCs/>
                 <w:sz w:val="36"/>
@@ -215,7 +215,7 @@
             <w:pPr>
               <w:jc w:val="center"/>
               <w:rPr>
-                <w:rFonts w:asciiTheme="majorBidi" w:hAnsiTheme="majorBidi" w:cstheme="majorBidi" w:hint="cs"/>
+                <w:rFonts w:asciiTheme="majorBidi" w:hAnsiTheme="majorBidi" w:cstheme="majorBidi"/>
                 <w:b/>
                 <w:bCs/>
                 <w:sz w:val="36"/>
@@ -365,7 +365,7 @@
                     <w:bidi/>
                     <w:jc w:val="center"/>
                     <w:rPr>
-                      <w:rFonts w:asciiTheme="majorBidi" w:hAnsiTheme="majorBidi" w:cstheme="majorBidi" w:hint="cs"/>
+                      <w:rFonts w:asciiTheme="majorBidi" w:hAnsiTheme="majorBidi" w:cstheme="majorBidi"/>
                       <w:b/>
                       <w:bCs/>
                       <w:sz w:val="36"/>
@@ -429,7 +429,7 @@
                     <w:bidi/>
                     <w:jc w:val="center"/>
                     <w:rPr>
-                      <w:rFonts w:asciiTheme="majorBidi" w:hAnsiTheme="majorBidi" w:cstheme="majorBidi" w:hint="cs"/>
+                      <w:rFonts w:asciiTheme="majorBidi" w:hAnsiTheme="majorBidi" w:cstheme="majorBidi"/>
                       <w:b/>
                       <w:bCs/>
                       <w:sz w:val="36"/>
@@ -461,7 +461,7 @@
                     <w:bidi/>
                     <w:jc w:val="center"/>
                     <w:rPr>
-                      <w:rFonts w:asciiTheme="majorBidi" w:hAnsiTheme="majorBidi" w:cstheme="majorBidi" w:hint="cs"/>
+                      <w:rFonts w:asciiTheme="majorBidi" w:hAnsiTheme="majorBidi" w:cstheme="majorBidi"/>
                       <w:b/>
                       <w:bCs/>
                       <w:sz w:val="36"/>
@@ -494,7 +494,7 @@
                     <w:bidi/>
                     <w:jc w:val="center"/>
                     <w:rPr>
-                      <w:rFonts w:asciiTheme="majorBidi" w:hAnsiTheme="majorBidi" w:cstheme="majorBidi" w:hint="cs"/>
+                      <w:rFonts w:asciiTheme="majorBidi" w:hAnsiTheme="majorBidi" w:cstheme="majorBidi"/>
                       <w:b/>
                       <w:bCs/>
                       <w:sz w:val="36"/>
@@ -526,7 +526,7 @@
                     <w:bidi/>
                     <w:jc w:val="center"/>
                     <w:rPr>
-                      <w:rFonts w:asciiTheme="majorBidi" w:hAnsiTheme="majorBidi" w:cstheme="majorBidi" w:hint="cs"/>
+                      <w:rFonts w:asciiTheme="majorBidi" w:hAnsiTheme="majorBidi" w:cstheme="majorBidi"/>
                       <w:b/>
                       <w:bCs/>
                       <w:sz w:val="36"/>
@@ -559,7 +559,7 @@
                     <w:bidi/>
                     <w:jc w:val="center"/>
                     <w:rPr>
-                      <w:rFonts w:asciiTheme="majorBidi" w:hAnsiTheme="majorBidi" w:cstheme="majorBidi" w:hint="cs"/>
+                      <w:rFonts w:asciiTheme="majorBidi" w:hAnsiTheme="majorBidi" w:cstheme="majorBidi"/>
                       <w:b/>
                       <w:bCs/>
                       <w:sz w:val="36"/>
@@ -591,7 +591,7 @@
                     <w:bidi/>
                     <w:jc w:val="center"/>
                     <w:rPr>
-                      <w:rFonts w:asciiTheme="majorBidi" w:hAnsiTheme="majorBidi" w:cstheme="majorBidi" w:hint="cs"/>
+                      <w:rFonts w:asciiTheme="majorBidi" w:hAnsiTheme="majorBidi" w:cstheme="majorBidi"/>
                       <w:b/>
                       <w:bCs/>
                       <w:sz w:val="36"/>
@@ -624,7 +624,7 @@
                     <w:bidi/>
                     <w:jc w:val="center"/>
                     <w:rPr>
-                      <w:rFonts w:asciiTheme="majorBidi" w:hAnsiTheme="majorBidi" w:cstheme="majorBidi" w:hint="cs"/>
+                      <w:rFonts w:asciiTheme="majorBidi" w:hAnsiTheme="majorBidi" w:cstheme="majorBidi"/>
                       <w:b/>
                       <w:bCs/>
                       <w:sz w:val="36"/>
@@ -656,7 +656,7 @@
                     <w:bidi/>
                     <w:jc w:val="center"/>
                     <w:rPr>
-                      <w:rFonts w:asciiTheme="majorBidi" w:hAnsiTheme="majorBidi" w:cstheme="majorBidi" w:hint="cs"/>
+                      <w:rFonts w:asciiTheme="majorBidi" w:hAnsiTheme="majorBidi" w:cstheme="majorBidi"/>
                       <w:b/>
                       <w:bCs/>
                       <w:sz w:val="36"/>
@@ -689,7 +689,7 @@
                     <w:bidi/>
                     <w:jc w:val="center"/>
                     <w:rPr>
-                      <w:rFonts w:asciiTheme="majorBidi" w:hAnsiTheme="majorBidi" w:cstheme="majorBidi" w:hint="cs"/>
+                      <w:rFonts w:asciiTheme="majorBidi" w:hAnsiTheme="majorBidi" w:cstheme="majorBidi"/>
                       <w:b/>
                       <w:bCs/>
                       <w:sz w:val="36"/>
@@ -721,7 +721,7 @@
                     <w:bidi/>
                     <w:jc w:val="center"/>
                     <w:rPr>
-                      <w:rFonts w:asciiTheme="majorBidi" w:hAnsiTheme="majorBidi" w:cstheme="majorBidi" w:hint="cs"/>
+                      <w:rFonts w:asciiTheme="majorBidi" w:hAnsiTheme="majorBidi" w:cstheme="majorBidi"/>
                       <w:b/>
                       <w:bCs/>
                       <w:sz w:val="36"/>
@@ -754,7 +754,7 @@
                     <w:bidi/>
                     <w:jc w:val="center"/>
                     <w:rPr>
-                      <w:rFonts w:asciiTheme="majorBidi" w:hAnsiTheme="majorBidi" w:cstheme="majorBidi" w:hint="cs"/>
+                      <w:rFonts w:asciiTheme="majorBidi" w:hAnsiTheme="majorBidi" w:cstheme="majorBidi"/>
                       <w:b/>
                       <w:bCs/>
                       <w:sz w:val="36"/>
@@ -814,7 +814,7 @@
               <w:bidi/>
               <w:jc w:val="center"/>
               <w:rPr>
-                <w:rFonts w:asciiTheme="majorBidi" w:hAnsiTheme="majorBidi" w:cstheme="majorBidi" w:hint="cs"/>
+                <w:rFonts w:asciiTheme="majorBidi" w:hAnsiTheme="majorBidi" w:cstheme="majorBidi"/>
                 <w:b/>
                 <w:bCs/>
                 <w:sz w:val="36"/>
@@ -1143,19 +1143,7 @@
                     <w:szCs w:val="36"/>
                     <w:lang w:bidi="ar-EG"/>
                   </w:rPr>
-                  <m:t>a</m:t>
-                </m:r>
-                <m:r>
-                  <m:rPr>
-                    <m:sty m:val="bi"/>
-                  </m:rPr>
-                  <w:rPr>
-                    <w:rFonts w:ascii="Cambria Math" w:hAnsi="Cambria Math" w:cstheme="majorBidi"/>
-                    <w:sz w:val="36"/>
-                    <w:szCs w:val="36"/>
-                    <w:lang w:bidi="ar-EG"/>
-                  </w:rPr>
-                  <m:t xml:space="preserve">= </m:t>
+                  <m:t xml:space="preserve">a= </m:t>
                 </m:r>
                 <m:sSup>
                   <m:sSupPr>
@@ -1268,19 +1256,7 @@
                                 <w:szCs w:val="36"/>
                                 <w:lang w:bidi="ar-EG"/>
                               </w:rPr>
-                              <m:t>i</m:t>
-                            </m:r>
-                            <m:r>
-                              <m:rPr>
-                                <m:sty m:val="bi"/>
-                              </m:rPr>
-                              <w:rPr>
-                                <w:rFonts w:ascii="Cambria Math" w:hAnsi="Cambria Math" w:cstheme="majorBidi"/>
-                                <w:sz w:val="36"/>
-                                <w:szCs w:val="36"/>
-                                <w:lang w:bidi="ar-EG"/>
-                              </w:rPr>
-                              <m:t xml:space="preserve">   </m:t>
+                              <m:t xml:space="preserve">i   </m:t>
                             </m:r>
                           </m:sub>
                         </m:sSub>
@@ -1294,19 +1270,7 @@
                             <w:szCs w:val="36"/>
                             <w:lang w:bidi="ar-EG"/>
                           </w:rPr>
-                          <m:t>- µ</m:t>
-                        </m:r>
-                        <m:r>
-                          <m:rPr>
-                            <m:sty m:val="bi"/>
-                          </m:rPr>
-                          <w:rPr>
-                            <w:rFonts w:ascii="Cambria Math" w:hAnsi="Cambria Math" w:cstheme="majorBidi"/>
-                            <w:sz w:val="36"/>
-                            <w:szCs w:val="36"/>
-                            <w:lang w:bidi="ar-EG"/>
-                          </w:rPr>
-                          <m:t>)</m:t>
+                          <m:t>- µ)</m:t>
                         </m:r>
                       </m:e>
                     </m:nary>
@@ -1632,7 +1596,7 @@
             <w:pPr>
               <w:bidi/>
               <w:rPr>
-                <w:rFonts w:asciiTheme="majorBidi" w:hAnsiTheme="majorBidi" w:cstheme="majorBidi" w:hint="cs"/>
+                <w:rFonts w:asciiTheme="majorBidi" w:hAnsiTheme="majorBidi" w:cstheme="majorBidi"/>
                 <w:b/>
                 <w:bCs/>
                 <w:sz w:val="36"/>
@@ -2024,12 +1988,14 @@
     </w:p>
     <w:p>
       <w:pPr>
+        <w:bidi/>
         <w:rPr>
           <w:rFonts w:asciiTheme="majorBidi" w:hAnsiTheme="majorBidi" w:cstheme="majorBidi"/>
           <w:b/>
           <w:bCs/>
           <w:sz w:val="36"/>
           <w:szCs w:val="36"/>
+          <w:rtl/>
           <w:lang w:bidi="ar-EG"/>
         </w:rPr>
       </w:pPr>
@@ -2043,9 +2009,37 @@
           <w:lang w:bidi="ar-EG"/>
         </w:rPr>
         <w:tab/>
-        <w:t xml:space="preserve">- Correlation coefficient </w:t>
+        <w:t xml:space="preserve">- </w:t>
       </w:r>
       <w:r>
+        <w:rPr>
+          <w:rFonts w:asciiTheme="majorBidi" w:hAnsiTheme="majorBidi" w:cstheme="majorBidi" w:hint="cs"/>
+          <w:b/>
+          <w:bCs/>
+          <w:sz w:val="36"/>
+          <w:szCs w:val="36"/>
+          <w:rtl/>
+          <w:lang w:bidi="ar-EG"/>
+        </w:rPr>
+        <w:t xml:space="preserve"> </w:t>
+      </w:r>
+      <w:r>
+        <w:rPr>
+          <w:rFonts w:asciiTheme="majorBidi" w:hAnsiTheme="majorBidi" w:cstheme="majorBidi" w:hint="cs"/>
+          <w:b/>
+          <w:bCs/>
+          <w:sz w:val="36"/>
+          <w:szCs w:val="36"/>
+          <w:rtl/>
+          <w:lang w:bidi="ar-EG"/>
+        </w:rPr>
+        <w:t xml:space="preserve">التاسك هناك مرحله من مراحل تحسين الفلو تشارت ابحث عنها </w:t>
+      </w:r>
+    </w:p>
+    <w:p>
+      <w:pPr>
+        <w:bidi/>
+        <w:ind w:left="720" w:firstLine="720"/>
         <w:rPr>
           <w:rFonts w:asciiTheme="majorBidi" w:hAnsiTheme="majorBidi" w:cstheme="majorBidi"/>
           <w:b/>
@@ -2054,29 +2048,18 @@
           <w:szCs w:val="36"/>
           <w:lang w:bidi="ar-EG"/>
         </w:rPr>
-        <w:t>(a</w:t>
-      </w:r>
+      </w:pPr>
       <w:r>
         <w:rPr>
-          <w:rFonts w:asciiTheme="majorBidi" w:hAnsiTheme="majorBidi" w:cstheme="majorBidi"/>
+          <w:rFonts w:asciiTheme="majorBidi" w:hAnsiTheme="majorBidi" w:cstheme="majorBidi" w:hint="cs"/>
           <w:b/>
           <w:bCs/>
           <w:sz w:val="36"/>
           <w:szCs w:val="36"/>
+          <w:rtl/>
           <w:lang w:bidi="ar-EG"/>
         </w:rPr>
-        <w:t>lgorithm + flow chart + code</w:t>
-      </w:r>
-      <w:r>
-        <w:rPr>
-          <w:rFonts w:asciiTheme="majorBidi" w:hAnsiTheme="majorBidi" w:cstheme="majorBidi"/>
-          <w:b/>
-          <w:bCs/>
-          <w:sz w:val="36"/>
-          <w:szCs w:val="36"/>
-          <w:lang w:bidi="ar-EG"/>
-        </w:rPr>
-        <w:t>)</w:t>
+        <w:t>(اخرك تجعل الذاكء الاصطناعي يشرح لك مثلا معنى الانحرام المعياري او فكره اللوب بالتفصيل)</w:t>
       </w:r>
     </w:p>
     <w:sectPr>

</xml_diff>

<commit_message>
update files to add task
</commit_message>
<xml_diff>
--- a/02_standard_deviation/standard_deviation.docx
+++ b/02_standard_deviation/standard_deviation.docx
@@ -136,7 +136,7 @@
                 <w:szCs w:val="36"/>
                 <w:lang w:bidi="ar-EG"/>
               </w:rPr>
-              <w:t xml:space="preserve"> /Data</w:t>
+              <w:t>/Data</w:t>
             </w:r>
           </w:p>
         </w:tc>
@@ -232,7 +232,19 @@
                 <w:szCs w:val="36"/>
                 <w:lang w:bidi="ar-EG"/>
               </w:rPr>
-              <w:t>Steps/ Algorithm</w:t>
+              <w:t xml:space="preserve">Steps/ </w:t>
+            </w:r>
+            <w:r>
+              <w:rPr>
+                <w:rFonts w:asciiTheme="majorBidi" w:hAnsiTheme="majorBidi" w:cstheme="majorBidi"/>
+                <w:b/>
+                <w:bCs/>
+                <w:color w:val="C00000"/>
+                <w:sz w:val="36"/>
+                <w:szCs w:val="36"/>
+                <w:lang w:bidi="ar-EG"/>
+              </w:rPr>
+              <w:t>Algorithm</w:t>
             </w:r>
           </w:p>
         </w:tc>
@@ -264,31 +276,7 @@
                 <w:szCs w:val="36"/>
                 <w:lang w:bidi="ar-EG"/>
               </w:rPr>
-              <w:t xml:space="preserve">n, </w:t>
-            </w:r>
-            <w:proofErr w:type="gramStart"/>
-            <w:r>
-              <w:rPr>
-                <w:rFonts w:asciiTheme="majorBidi" w:hAnsiTheme="majorBidi" w:cstheme="majorBidi"/>
-                <w:b/>
-                <w:bCs/>
-                <w:sz w:val="36"/>
-                <w:szCs w:val="36"/>
-                <w:lang w:bidi="ar-EG"/>
-              </w:rPr>
-              <w:t>x[</w:t>
-            </w:r>
-            <w:proofErr w:type="gramEnd"/>
-            <w:r>
-              <w:rPr>
-                <w:rFonts w:asciiTheme="majorBidi" w:hAnsiTheme="majorBidi" w:cstheme="majorBidi"/>
-                <w:b/>
-                <w:bCs/>
-                <w:sz w:val="36"/>
-                <w:szCs w:val="36"/>
-                <w:lang w:bidi="ar-EG"/>
-              </w:rPr>
-              <w:t>]</w:t>
+              <w:t>n, x[]</w:t>
             </w:r>
           </w:p>
         </w:tc>
@@ -559,7 +547,6 @@
                       <w:lang w:bidi="ar-EG"/>
                     </w:rPr>
                   </w:pPr>
-                  <w:proofErr w:type="spellStart"/>
                   <w:r>
                     <w:rPr>
                       <w:rFonts w:asciiTheme="majorBidi" w:hAnsiTheme="majorBidi" w:cstheme="majorBidi"/>
@@ -571,7 +558,6 @@
                     </w:rPr>
                     <w:t>i</w:t>
                   </w:r>
-                  <w:proofErr w:type="spellEnd"/>
                 </w:p>
               </w:tc>
             </w:tr>
@@ -626,7 +612,6 @@
                       <w:lang w:bidi="ar-EG"/>
                     </w:rPr>
                   </w:pPr>
-                  <w:proofErr w:type="spellStart"/>
                   <w:r>
                     <w:rPr>
                       <w:rFonts w:asciiTheme="majorBidi" w:hAnsiTheme="majorBidi" w:cstheme="majorBidi"/>
@@ -638,7 +623,6 @@
                     </w:rPr>
                     <w:t>ave</w:t>
                   </w:r>
-                  <w:proofErr w:type="spellEnd"/>
                 </w:p>
               </w:tc>
             </w:tr>
@@ -2122,7 +2106,55 @@
           <w:rtl/>
           <w:lang w:bidi="ar-EG"/>
         </w:rPr>
-        <w:t>(اخرك تجعل الذاكء الاصطناعي يشرح لك مثلا معنى الانحرام المعياري او فكره اللوب بالتفصيل)</w:t>
+        <w:t>(اخرك تجعل الذك</w:t>
+      </w:r>
+      <w:r>
+        <w:rPr>
+          <w:rFonts w:asciiTheme="majorBidi" w:hAnsiTheme="majorBidi" w:cstheme="majorBidi" w:hint="cs"/>
+          <w:b/>
+          <w:bCs/>
+          <w:sz w:val="36"/>
+          <w:szCs w:val="36"/>
+          <w:rtl/>
+          <w:lang w:bidi="ar-EG"/>
+        </w:rPr>
+        <w:t>ا</w:t>
+      </w:r>
+      <w:r>
+        <w:rPr>
+          <w:rFonts w:asciiTheme="majorBidi" w:hAnsiTheme="majorBidi" w:cstheme="majorBidi" w:hint="cs"/>
+          <w:b/>
+          <w:bCs/>
+          <w:sz w:val="36"/>
+          <w:szCs w:val="36"/>
+          <w:rtl/>
+          <w:lang w:bidi="ar-EG"/>
+        </w:rPr>
+        <w:t>ء الاصطناعي يشرح لك مثلا معنى الانحرا</w:t>
+      </w:r>
+      <w:r>
+        <w:rPr>
+          <w:rFonts w:asciiTheme="majorBidi" w:hAnsiTheme="majorBidi" w:cstheme="majorBidi" w:hint="cs"/>
+          <w:b/>
+          <w:bCs/>
+          <w:sz w:val="36"/>
+          <w:szCs w:val="36"/>
+          <w:rtl/>
+          <w:lang w:bidi="ar-EG"/>
+        </w:rPr>
+        <w:t>ف</w:t>
+      </w:r>
+      <w:r>
+        <w:rPr>
+          <w:rFonts w:asciiTheme="majorBidi" w:hAnsiTheme="majorBidi" w:cstheme="majorBidi" w:hint="cs"/>
+          <w:b/>
+          <w:bCs/>
+          <w:sz w:val="36"/>
+          <w:szCs w:val="36"/>
+          <w:rtl/>
+          <w:lang w:bidi="ar-EG"/>
+        </w:rPr>
+        <w:t xml:space="preserve"> المعياري او فكره اللوب بالتفصيل)</w:t>
       </w:r>
     </w:p>
     <w:sectPr>

</xml_diff>